<commit_message>
adde final code files
</commit_message>
<xml_diff>
--- a/Documents/Research Papers Summary.docx
+++ b/Documents/Research Papers Summary.docx
@@ -63,7 +63,6 @@
         <w:pStyle w:val="NormalWeb"/>
         <w:ind w:left="720"/>
       </w:pPr>
-      <w:proofErr w:type="gramStart"/>
       <w:r>
         <w:rPr>
           <w:rFonts w:hAnsi="Symbol"/>
@@ -80,17 +79,8 @@
         </w:rPr>
         <w:t>Authors</w:t>
       </w:r>
-      <w:proofErr w:type="gramEnd"/>
-      <w:r>
-        <w:t xml:space="preserve">: </w:t>
-      </w:r>
-      <w:proofErr w:type="spellStart"/>
-      <w:r>
-        <w:t>Chusnul</w:t>
-      </w:r>
-      <w:proofErr w:type="spellEnd"/>
-      <w:r>
-        <w:t xml:space="preserve"> Arif et al.</w:t>
+      <w:r>
+        <w:t>: Chusnul Arif et al.</w:t>
       </w:r>
     </w:p>
     <w:p>
@@ -3443,15 +3433,7 @@
         <w:t>My</w:t>
       </w:r>
       <w:r>
-        <w:t xml:space="preserve"> system </w:t>
-      </w:r>
-      <w:proofErr w:type="gramStart"/>
-      <w:r>
-        <w:t>improves on</w:t>
-      </w:r>
-      <w:proofErr w:type="gramEnd"/>
-      <w:r>
-        <w:t xml:space="preserve"> satellite-based monitoring by:</w:t>
+        <w:t xml:space="preserve"> system improves on satellite-based monitoring by:</w:t>
       </w:r>
     </w:p>
     <w:p>
@@ -3499,16 +3481,11 @@
         <w:t>Real-time adaptability</w:t>
       </w:r>
       <w:r>
-        <w:t xml:space="preserve">, responding to immediate field </w:t>
-      </w:r>
-      <w:proofErr w:type="gramStart"/>
-      <w:r>
-        <w:t>conditions</w:t>
+        <w:t>, responding to immediate field conditions</w:t>
       </w:r>
       <w:r>
         <w:t>(</w:t>
       </w:r>
-      <w:proofErr w:type="gramEnd"/>
       <w:r>
         <w:t>moisture</w:t>
       </w:r>
@@ -3803,13 +3780,8 @@
         </w:numPr>
         <w:spacing w:before="100" w:beforeAutospacing="1" w:after="100" w:afterAutospacing="1"/>
       </w:pPr>
-      <w:proofErr w:type="gramStart"/>
-      <w:r>
-        <w:t>Performs</w:t>
-      </w:r>
-      <w:proofErr w:type="gramEnd"/>
-      <w:r>
-        <w:t xml:space="preserve"> </w:t>
+      <w:r>
+        <w:t xml:space="preserve">Performs </w:t>
       </w:r>
       <w:r>
         <w:rPr>
@@ -4454,13 +4426,8 @@
             <w:hideMark/>
           </w:tcPr>
           <w:p>
-            <w:proofErr w:type="gramStart"/>
-            <w:r>
-              <w:t>Focuses</w:t>
-            </w:r>
-            <w:proofErr w:type="gramEnd"/>
-            <w:r>
-              <w:t xml:space="preserve"> on </w:t>
+            <w:r>
+              <w:t xml:space="preserve">Focuses on </w:t>
             </w:r>
             <w:r>
               <w:rPr>
@@ -4869,13 +4836,17 @@
       <w:r>
         <w:t xml:space="preserve">: </w:t>
       </w:r>
-      <w:proofErr w:type="spellStart"/>
-      <w:r>
-        <w:t>Nirala</w:t>
-      </w:r>
-      <w:proofErr w:type="spellEnd"/>
-      <w:r>
-        <w:t xml:space="preserve"> et al.</w:t>
+      <w:r>
+        <w:rPr>
+          <w:rFonts w:eastAsiaTheme="majorEastAsia"/>
+        </w:rPr>
+        <w:t>Chatterjee</w:t>
+      </w:r>
+      <w:r>
+        <w:rPr>
+          <w:rFonts w:eastAsiaTheme="majorEastAsia"/>
+        </w:rPr>
+        <w:t xml:space="preserve"> </w:t>
       </w:r>
     </w:p>
     <w:p>
@@ -5172,23 +5143,7 @@
                 <w:b/>
                 <w:bCs/>
               </w:rPr>
-              <w:t>Optimized ML Approach (</w:t>
-            </w:r>
-            <w:proofErr w:type="spellStart"/>
-            <w:r>
-              <w:rPr>
-                <w:b/>
-                <w:bCs/>
-              </w:rPr>
-              <w:t>Nirala</w:t>
-            </w:r>
-            <w:proofErr w:type="spellEnd"/>
-            <w:r>
-              <w:rPr>
-                <w:b/>
-                <w:bCs/>
-              </w:rPr>
-              <w:t xml:space="preserve"> et al.)</w:t>
+              <w:t>Optimized ML Approach (Nirala et al.)</w:t>
             </w:r>
           </w:p>
         </w:tc>
@@ -5973,7 +5928,27 @@
             <w:sz w:val="27"/>
             <w:szCs w:val="27"/>
           </w:rPr>
-          <w:t>https://drive.google.com/file/d/1huQcC0gNh5N65YFNx3Ds4FTrvNGJG4fF/view?usp=drive_link</w:t>
+          <w:t>https://drive.</w:t>
+        </w:r>
+        <w:r>
+          <w:rPr>
+            <w:rStyle w:val="Hyperlink"/>
+            <w:b/>
+            <w:bCs/>
+            <w:sz w:val="27"/>
+            <w:szCs w:val="27"/>
+          </w:rPr>
+          <w:t>g</w:t>
+        </w:r>
+        <w:r>
+          <w:rPr>
+            <w:rStyle w:val="Hyperlink"/>
+            <w:b/>
+            <w:bCs/>
+            <w:sz w:val="27"/>
+            <w:szCs w:val="27"/>
+          </w:rPr>
+          <w:t>oogle.com/file/d/1huQcC0gNh5N65YFNx3Ds4FTrvNGJG4fF/view?usp=drive_link</w:t>
         </w:r>
       </w:hyperlink>
     </w:p>
@@ -6026,21 +6001,8 @@
       <w:r>
         <w:t xml:space="preserve">: </w:t>
       </w:r>
-      <w:proofErr w:type="spellStart"/>
-      <w:r>
-        <w:t>Shahaboddin</w:t>
-      </w:r>
-      <w:proofErr w:type="spellEnd"/>
-      <w:r>
-        <w:t xml:space="preserve"> </w:t>
-      </w:r>
-      <w:proofErr w:type="spellStart"/>
-      <w:r>
-        <w:t>Shamshirband</w:t>
-      </w:r>
-      <w:proofErr w:type="spellEnd"/>
-      <w:r>
-        <w:t xml:space="preserve"> et al.</w:t>
+      <w:r>
+        <w:t>prasad</w:t>
       </w:r>
     </w:p>
     <w:p>
@@ -6061,7 +6023,6 @@
       <w:r>
         <w:t xml:space="preserve">: </w:t>
       </w:r>
-      <w:proofErr w:type="spellStart"/>
       <w:r>
         <w:rPr>
           <w:i/>
@@ -6069,7 +6030,6 @@
         </w:rPr>
         <w:t>Geoderma</w:t>
       </w:r>
-      <w:proofErr w:type="spellEnd"/>
       <w:r>
         <w:t>, 2018</w:t>
       </w:r>
@@ -6173,15 +6133,7 @@
         <w:spacing w:before="100" w:beforeAutospacing="1" w:after="100" w:afterAutospacing="1"/>
       </w:pPr>
       <w:r>
-        <w:t xml:space="preserve">Uses meteorological </w:t>
-      </w:r>
-      <w:proofErr w:type="gramStart"/>
-      <w:r>
-        <w:t>inputs</w:t>
-      </w:r>
-      <w:proofErr w:type="gramEnd"/>
-      <w:r>
-        <w:t>: rainfall, temperature, evaporation, humidity.</w:t>
+        <w:t>Uses meteorological inputs: rainfall, temperature, evaporation, humidity.</w:t>
       </w:r>
     </w:p>
     <w:p>
@@ -6307,23 +6259,29 @@
                 <w:b/>
                 <w:bCs/>
               </w:rPr>
-              <w:t>Hybrid Forecasting Model (</w:t>
-            </w:r>
-            <w:proofErr w:type="spellStart"/>
-            <w:r>
+              <w:t>Hybrid Forecasting Model (Shamshirband et al.)</w:t>
+            </w:r>
+          </w:p>
+        </w:tc>
+        <w:tc>
+          <w:tcPr>
+            <w:tcW w:w="0" w:type="auto"/>
+            <w:hideMark/>
+          </w:tcPr>
+          <w:p>
+            <w:pPr>
+              <w:jc w:val="center"/>
               <w:rPr>
                 <w:b/>
                 <w:bCs/>
               </w:rPr>
-              <w:t>Shamshirband</w:t>
-            </w:r>
-            <w:proofErr w:type="spellEnd"/>
+            </w:pPr>
             <w:r>
               <w:rPr>
                 <w:b/>
                 <w:bCs/>
               </w:rPr>
-              <w:t xml:space="preserve"> et al.)</w:t>
+              <w:t>Your Proposed System</w:t>
             </w:r>
           </w:p>
         </w:tc>
@@ -6345,28 +6303,6 @@
                 <w:b/>
                 <w:bCs/>
               </w:rPr>
-              <w:t>Your Proposed System</w:t>
-            </w:r>
-          </w:p>
-        </w:tc>
-        <w:tc>
-          <w:tcPr>
-            <w:tcW w:w="0" w:type="auto"/>
-            <w:hideMark/>
-          </w:tcPr>
-          <w:p>
-            <w:pPr>
-              <w:jc w:val="center"/>
-              <w:rPr>
-                <w:b/>
-                <w:bCs/>
-              </w:rPr>
-            </w:pPr>
-            <w:r>
-              <w:rPr>
-                <w:b/>
-                <w:bCs/>
-              </w:rPr>
               <w:t>Technological Gap</w:t>
             </w:r>
           </w:p>
@@ -6851,13 +6787,8 @@
         </w:numPr>
         <w:spacing w:before="100" w:beforeAutospacing="1" w:after="100" w:afterAutospacing="1"/>
       </w:pPr>
-      <w:proofErr w:type="gramStart"/>
-      <w:r>
-        <w:t>Applies</w:t>
-      </w:r>
-      <w:proofErr w:type="gramEnd"/>
-      <w:r>
-        <w:t xml:space="preserve"> predictions directly into </w:t>
+      <w:r>
+        <w:t xml:space="preserve">Applies predictions directly into </w:t>
       </w:r>
       <w:r>
         <w:rPr>
@@ -7052,7 +6983,27 @@
             <w:sz w:val="27"/>
             <w:szCs w:val="27"/>
           </w:rPr>
-          <w:t>https://www.sciencedirect.com/science/article/pii/S095741742200269X</w:t>
+          <w:t>https://www.sc</w:t>
+        </w:r>
+        <w:r>
+          <w:rPr>
+            <w:rStyle w:val="Hyperlink"/>
+            <w:b/>
+            <w:bCs/>
+            <w:sz w:val="27"/>
+            <w:szCs w:val="27"/>
+          </w:rPr>
+          <w:t>i</w:t>
+        </w:r>
+        <w:r>
+          <w:rPr>
+            <w:rStyle w:val="Hyperlink"/>
+            <w:b/>
+            <w:bCs/>
+            <w:sz w:val="27"/>
+            <w:szCs w:val="27"/>
+          </w:rPr>
+          <w:t>encedirect.com/science/article/pii/S095741742200269X</w:t>
         </w:r>
       </w:hyperlink>
     </w:p>
@@ -7093,7 +7044,27 @@
             <w:sz w:val="27"/>
             <w:szCs w:val="27"/>
           </w:rPr>
-          <w:t>https://drive.google.com/file/d/1EyppEiKk86mwOdT1DlyenwjcFidrcDJg/view?usp=drive_link</w:t>
+          <w:t>https://drive.google.com/file/d/1EyppEiKk86mwOdT1DlyenwjcFidrcDJg/view?usp=dri</w:t>
+        </w:r>
+        <w:r>
+          <w:rPr>
+            <w:rStyle w:val="Hyperlink"/>
+            <w:b/>
+            <w:bCs/>
+            <w:sz w:val="27"/>
+            <w:szCs w:val="27"/>
+          </w:rPr>
+          <w:t>v</w:t>
+        </w:r>
+        <w:r>
+          <w:rPr>
+            <w:rStyle w:val="Hyperlink"/>
+            <w:b/>
+            <w:bCs/>
+            <w:sz w:val="27"/>
+            <w:szCs w:val="27"/>
+          </w:rPr>
+          <w:t>e_link</w:t>
         </w:r>
       </w:hyperlink>
     </w:p>
@@ -7135,7 +7106,17 @@
         <w:t>Authors</w:t>
       </w:r>
       <w:r>
-        <w:t>: Zhang et al.</w:t>
+        <w:t xml:space="preserve">: </w:t>
+      </w:r>
+      <w:r>
+        <w:t>Kurtulmus</w:t>
+      </w:r>
+      <w:r>
+        <w:rPr>
+          <w:b/>
+          <w:bCs/>
+        </w:rPr>
+        <w:t xml:space="preserve"> </w:t>
       </w:r>
     </w:p>
     <w:p>
@@ -7504,7 +7485,6 @@
             <w:hideMark/>
           </w:tcPr>
           <w:p>
-            <w:proofErr w:type="gramStart"/>
             <w:r>
               <w:rPr>
                 <w:rStyle w:val="Strong"/>
@@ -7512,7 +7492,6 @@
               </w:rPr>
               <w:t>Main Focus</w:t>
             </w:r>
-            <w:proofErr w:type="gramEnd"/>
           </w:p>
         </w:tc>
         <w:tc>
@@ -7746,15 +7725,7 @@
           </w:tcPr>
           <w:p>
             <w:r>
-              <w:t xml:space="preserve">DL improves soil </w:t>
-            </w:r>
-            <w:proofErr w:type="gramStart"/>
-            <w:r>
-              <w:t>moisture class</w:t>
-            </w:r>
-            <w:proofErr w:type="gramEnd"/>
-            <w:r>
-              <w:t xml:space="preserve"> recognition (</w:t>
+              <w:t>DL improves soil moisture class recognition (</w:t>
             </w:r>
             <w:r>
               <w:rPr>
@@ -8014,15 +7985,7 @@
           </w:tcPr>
           <w:p>
             <w:r>
-              <w:t xml:space="preserve">Built to work across changing </w:t>
-            </w:r>
-            <w:proofErr w:type="gramStart"/>
-            <w:r>
-              <w:t>field</w:t>
-            </w:r>
-            <w:proofErr w:type="gramEnd"/>
-            <w:r>
-              <w:t>, weather, and soil conditions</w:t>
+              <w:t>Built to work across changing field, weather, and soil conditions</w:t>
             </w:r>
           </w:p>
         </w:tc>
@@ -8593,23 +8556,7 @@
           <w:b/>
           <w:bCs/>
         </w:rPr>
-        <w:t>Automated Machine Learning (</w:t>
-      </w:r>
-      <w:proofErr w:type="spellStart"/>
-      <w:r>
-        <w:rPr>
-          <w:b/>
-          <w:bCs/>
-        </w:rPr>
-        <w:t>AutoML</w:t>
-      </w:r>
-      <w:proofErr w:type="spellEnd"/>
-      <w:r>
-        <w:rPr>
-          <w:b/>
-          <w:bCs/>
-        </w:rPr>
-        <w:t>)</w:t>
+        <w:t>Automated Machine Learning (AutoML)</w:t>
       </w:r>
       <w:r>
         <w:t xml:space="preserve"> with multiple models (NN, DRF, GBM, GLM)</w:t>
@@ -8763,7 +8710,6 @@
       <w:r>
         <w:t xml:space="preserve">Demonstrated the power of </w:t>
       </w:r>
-      <w:proofErr w:type="spellStart"/>
       <w:r>
         <w:rPr>
           <w:b/>
@@ -8771,7 +8717,6 @@
         </w:rPr>
         <w:t>AutoML</w:t>
       </w:r>
-      <w:proofErr w:type="spellEnd"/>
       <w:r>
         <w:t xml:space="preserve"> combined with </w:t>
       </w:r>
@@ -9143,15 +9088,7 @@
           </w:tcPr>
           <w:p>
             <w:r>
-              <w:t xml:space="preserve">Model trained </w:t>
-            </w:r>
-            <w:proofErr w:type="gramStart"/>
-            <w:r>
-              <w:t>on</w:t>
-            </w:r>
-            <w:proofErr w:type="gramEnd"/>
-            <w:r>
-              <w:t xml:space="preserve"> past data, not designed for </w:t>
+              <w:t xml:space="preserve">Model trained on past data, not designed for </w:t>
             </w:r>
             <w:r>
               <w:rPr>
@@ -9364,15 +9301,7 @@
           </w:tcPr>
           <w:p>
             <w:r>
-              <w:t xml:space="preserve">No </w:t>
-            </w:r>
-            <w:proofErr w:type="gramStart"/>
-            <w:r>
-              <w:t>tailoring to</w:t>
-            </w:r>
-            <w:proofErr w:type="gramEnd"/>
-            <w:r>
-              <w:t xml:space="preserve"> </w:t>
+              <w:t xml:space="preserve">No tailoring to </w:t>
             </w:r>
             <w:r>
               <w:rPr>
@@ -11155,23 +11084,7 @@
           <w:b/>
           <w:bCs/>
         </w:rPr>
-        <w:t xml:space="preserve">Motorized </w:t>
-      </w:r>
-      <w:proofErr w:type="gramStart"/>
-      <w:r>
-        <w:rPr>
-          <w:b/>
-          <w:bCs/>
-        </w:rPr>
-        <w:t>sluice</w:t>
-      </w:r>
-      <w:proofErr w:type="gramEnd"/>
-      <w:r>
-        <w:rPr>
-          <w:b/>
-          <w:bCs/>
-        </w:rPr>
-        <w:t xml:space="preserve"> and feeder canal gates</w:t>
+        <w:t>Motorized sluice and feeder canal gates</w:t>
       </w:r>
     </w:p>
     <w:p>
@@ -12826,13 +12739,8 @@
         </w:numPr>
         <w:spacing w:before="100" w:beforeAutospacing="1" w:after="100" w:afterAutospacing="1"/>
       </w:pPr>
-      <w:proofErr w:type="gramStart"/>
-      <w:r>
-        <w:t>Replaces</w:t>
-      </w:r>
-      <w:proofErr w:type="gramEnd"/>
-      <w:r>
-        <w:t xml:space="preserve"> static PID logic with </w:t>
+      <w:r>
+        <w:t xml:space="preserve">Replaces static PID logic with </w:t>
       </w:r>
       <w:r>
         <w:rPr>
@@ -12885,13 +12793,8 @@
         </w:numPr>
         <w:spacing w:before="100" w:beforeAutospacing="1" w:after="100" w:afterAutospacing="1"/>
       </w:pPr>
-      <w:proofErr w:type="gramStart"/>
-      <w:r>
-        <w:t>Enhances</w:t>
-      </w:r>
-      <w:proofErr w:type="gramEnd"/>
-      <w:r>
-        <w:t xml:space="preserve"> forecast flexibility with </w:t>
+      <w:r>
+        <w:t xml:space="preserve">Enhances forecast flexibility with </w:t>
       </w:r>
       <w:r>
         <w:rPr>
@@ -13161,23 +13064,7 @@
           <w:b/>
           <w:bCs/>
         </w:rPr>
-        <w:t xml:space="preserve">fuzzy logic-based automatic </w:t>
-      </w:r>
-      <w:proofErr w:type="spellStart"/>
-      <w:r>
-        <w:rPr>
-          <w:b/>
-          <w:bCs/>
-        </w:rPr>
-        <w:t>watergate</w:t>
-      </w:r>
-      <w:proofErr w:type="spellEnd"/>
-      <w:r>
-        <w:rPr>
-          <w:b/>
-          <w:bCs/>
-        </w:rPr>
-        <w:t xml:space="preserve"> system</w:t>
+        <w:t>fuzzy logic-based automatic watergate system</w:t>
       </w:r>
       <w:r>
         <w:t xml:space="preserve"> using:</w:t>
@@ -13319,15 +13206,7 @@
         <w:spacing w:before="100" w:beforeAutospacing="1" w:after="100" w:afterAutospacing="1"/>
       </w:pPr>
       <w:r>
-        <w:t xml:space="preserve">Radio modules (NRF24L01) </w:t>
-      </w:r>
-      <w:proofErr w:type="gramStart"/>
-      <w:r>
-        <w:t>used</w:t>
-      </w:r>
-      <w:proofErr w:type="gramEnd"/>
-      <w:r>
-        <w:t xml:space="preserve"> for </w:t>
+        <w:t xml:space="preserve">Radio modules (NRF24L01) used for </w:t>
       </w:r>
       <w:r>
         <w:rPr>
@@ -13349,15 +13228,7 @@
         <w:spacing w:before="100" w:beforeAutospacing="1" w:after="100" w:afterAutospacing="1"/>
       </w:pPr>
       <w:r>
-        <w:t xml:space="preserve">MATLAB </w:t>
-      </w:r>
-      <w:proofErr w:type="gramStart"/>
-      <w:r>
-        <w:t>used</w:t>
-      </w:r>
-      <w:proofErr w:type="gramEnd"/>
-      <w:r>
-        <w:t xml:space="preserve"> for rule development and defuzzification logic testing.</w:t>
+        <w:t>MATLAB used for rule development and defuzzification logic testing.</w:t>
       </w:r>
     </w:p>
     <w:p>
@@ -14254,21 +14125,12 @@
       <w:r>
         <w:t xml:space="preserve"> module to send data to </w:t>
       </w:r>
-      <w:proofErr w:type="spellStart"/>
-      <w:r>
-        <w:rPr>
-          <w:b/>
-          <w:bCs/>
-        </w:rPr>
-        <w:t>ThingSpeak</w:t>
-      </w:r>
-      <w:proofErr w:type="spellEnd"/>
-      <w:r>
-        <w:rPr>
-          <w:b/>
-          <w:bCs/>
-        </w:rPr>
-        <w:t xml:space="preserve"> cloud</w:t>
+      <w:r>
+        <w:rPr>
+          <w:b/>
+          <w:bCs/>
+        </w:rPr>
+        <w:t>ThingSpeak cloud</w:t>
       </w:r>
     </w:p>
     <w:p>
@@ -14364,15 +14226,7 @@
         <w:spacing w:before="100" w:beforeAutospacing="1" w:after="100" w:afterAutospacing="1"/>
       </w:pPr>
       <w:r>
-        <w:t xml:space="preserve">System includes a web dashboard via </w:t>
-      </w:r>
-      <w:proofErr w:type="spellStart"/>
-      <w:r>
-        <w:t>ThingSpeak</w:t>
-      </w:r>
-      <w:proofErr w:type="spellEnd"/>
-      <w:r>
-        <w:t xml:space="preserve"> for real-time data access.</w:t>
+        <w:t>System includes a web dashboard via ThingSpeak for real-time data access.</w:t>
       </w:r>
     </w:p>
     <w:p>
@@ -14959,15 +14813,7 @@
           </w:tcPr>
           <w:p>
             <w:r>
-              <w:t xml:space="preserve">Cannot </w:t>
-            </w:r>
-            <w:proofErr w:type="gramStart"/>
-            <w:r>
-              <w:t>plan ahead</w:t>
-            </w:r>
-            <w:proofErr w:type="gramEnd"/>
-            <w:r>
-              <w:t xml:space="preserve"> for </w:t>
+              <w:t xml:space="preserve">Cannot plan ahead for </w:t>
             </w:r>
             <w:r>
               <w:rPr>
@@ -15265,13 +15111,8 @@
         </w:numPr>
         <w:spacing w:before="100" w:beforeAutospacing="1" w:after="100" w:afterAutospacing="1"/>
       </w:pPr>
-      <w:proofErr w:type="gramStart"/>
-      <w:r>
-        <w:t>Integrates</w:t>
-      </w:r>
-      <w:proofErr w:type="gramEnd"/>
-      <w:r>
-        <w:t xml:space="preserve"> </w:t>
+      <w:r>
+        <w:t xml:space="preserve">Integrates </w:t>
       </w:r>
       <w:r>
         <w:rPr>
@@ -15361,15 +15202,7 @@
         <w:t>5</w:t>
       </w:r>
       <w:r>
-        <w:t xml:space="preserve"> - Design and Control System of Sluice Gate </w:t>
-      </w:r>
-      <w:proofErr w:type="gramStart"/>
-      <w:r>
-        <w:t>With</w:t>
-      </w:r>
-      <w:proofErr w:type="gramEnd"/>
-      <w:r>
-        <w:t xml:space="preserve"> Web-Based Information</w:t>
+        <w:t xml:space="preserve"> - Design and Control System of Sluice Gate With Web-Based Information</w:t>
       </w:r>
     </w:p>
     <w:p>
@@ -15514,21 +15347,8 @@
         <w:t>Authors</w:t>
       </w:r>
       <w:r>
-        <w:t xml:space="preserve">: </w:t>
-      </w:r>
-      <w:proofErr w:type="spellStart"/>
-      <w:r>
-        <w:t>Desnanjaya</w:t>
-      </w:r>
-      <w:proofErr w:type="spellEnd"/>
-      <w:r>
-        <w:t xml:space="preserve"> &amp; </w:t>
-      </w:r>
-      <w:proofErr w:type="spellStart"/>
-      <w:r>
-        <w:t>Nugraha</w:t>
-      </w:r>
-      <w:proofErr w:type="spellEnd"/>
+        <w:t>: Desnanjaya &amp; Nugraha</w:t>
+      </w:r>
     </w:p>
     <w:p>
       <w:pPr>
@@ -15619,15 +15439,7 @@
         <w:t>Automatically monitors water level</w:t>
       </w:r>
       <w:r>
-        <w:t xml:space="preserve"> at the field gate (“</w:t>
-      </w:r>
-      <w:proofErr w:type="spellStart"/>
-      <w:r>
-        <w:t>Temuku</w:t>
-      </w:r>
-      <w:proofErr w:type="spellEnd"/>
-      <w:r>
-        <w:t xml:space="preserve">”) and allows farmers to control it </w:t>
+        <w:t xml:space="preserve"> at the field gate (“Temuku”) and allows farmers to control it </w:t>
       </w:r>
       <w:r>
         <w:rPr>
@@ -15800,37 +15612,12 @@
         </w:numPr>
         <w:spacing w:before="100" w:beforeAutospacing="1" w:after="100" w:afterAutospacing="1"/>
       </w:pPr>
-      <w:proofErr w:type="spellStart"/>
-      <w:r>
-        <w:rPr>
-          <w:b/>
-          <w:bCs/>
-        </w:rPr>
-        <w:t>Pekaseh</w:t>
-      </w:r>
-      <w:proofErr w:type="spellEnd"/>
-      <w:r>
-        <w:rPr>
-          <w:b/>
-          <w:bCs/>
-        </w:rPr>
-        <w:t xml:space="preserve"> (</w:t>
-      </w:r>
-      <w:proofErr w:type="spellStart"/>
-      <w:r>
-        <w:rPr>
-          <w:b/>
-          <w:bCs/>
-        </w:rPr>
-        <w:t>subak</w:t>
-      </w:r>
-      <w:proofErr w:type="spellEnd"/>
-      <w:r>
-        <w:rPr>
-          <w:b/>
-          <w:bCs/>
-        </w:rPr>
-        <w:t xml:space="preserve"> leader)</w:t>
+      <w:r>
+        <w:rPr>
+          <w:b/>
+          <w:bCs/>
+        </w:rPr>
+        <w:t>Pekaseh (subak leader)</w:t>
       </w:r>
       <w:r>
         <w:t xml:space="preserve"> – manage accounts</w:t>
@@ -15991,15 +15778,7 @@
         <w:t>✅</w:t>
       </w:r>
       <w:r>
-        <w:t xml:space="preserve"> Avg. 650.8 </w:t>
-      </w:r>
-      <w:proofErr w:type="spellStart"/>
-      <w:r>
-        <w:t>ms</w:t>
-      </w:r>
-      <w:proofErr w:type="spellEnd"/>
-      <w:r>
-        <w:t xml:space="preserve"> load time</w:t>
+        <w:t xml:space="preserve"> Avg. 650.8 ms load time</w:t>
       </w:r>
     </w:p>
     <w:p>
@@ -16177,40 +15956,87 @@
                 <w:rStyle w:val="Strong"/>
                 <w:rFonts w:eastAsiaTheme="majorEastAsia"/>
               </w:rPr>
-              <w:t xml:space="preserve">AI/ML predicts future irrigation </w:t>
-            </w:r>
-            <w:proofErr w:type="gramStart"/>
+              <w:t>AI/ML predicts future irrigation need</w:t>
+            </w:r>
+            <w:r>
+              <w:t xml:space="preserve"> based on multiple sensors</w:t>
+            </w:r>
+          </w:p>
+        </w:tc>
+        <w:tc>
+          <w:tcPr>
+            <w:tcW w:w="0" w:type="auto"/>
+            <w:hideMark/>
+          </w:tcPr>
+          <w:p>
+            <w:r>
+              <w:t xml:space="preserve">No </w:t>
+            </w:r>
             <w:r>
               <w:rPr>
                 <w:rStyle w:val="Strong"/>
                 <w:rFonts w:eastAsiaTheme="majorEastAsia"/>
               </w:rPr>
-              <w:t>need</w:t>
-            </w:r>
-            <w:proofErr w:type="gramEnd"/>
-            <w:r>
-              <w:t xml:space="preserve"> based on multiple sensors</w:t>
-            </w:r>
-          </w:p>
-        </w:tc>
-        <w:tc>
-          <w:tcPr>
-            <w:tcW w:w="0" w:type="auto"/>
-            <w:hideMark/>
-          </w:tcPr>
-          <w:p>
-            <w:r>
-              <w:t xml:space="preserve">No </w:t>
+              <w:t>predictive control or intelligent scheduling</w:t>
+            </w:r>
+            <w:r>
+              <w:t>; system is fully reactive</w:t>
+            </w:r>
+          </w:p>
+        </w:tc>
+      </w:tr>
+      <w:tr>
+        <w:tc>
+          <w:tcPr>
+            <w:tcW w:w="0" w:type="auto"/>
+            <w:hideMark/>
+          </w:tcPr>
+          <w:p>
+            <w:r>
+              <w:t>Rain Forecasting</w:t>
+            </w:r>
+          </w:p>
+        </w:tc>
+        <w:tc>
+          <w:tcPr>
+            <w:tcW w:w="0" w:type="auto"/>
+            <w:hideMark/>
+          </w:tcPr>
+          <w:p>
+            <w:r>
+              <w:t>Not integrated; decisions made solely on current water level</w:t>
+            </w:r>
+          </w:p>
+        </w:tc>
+        <w:tc>
+          <w:tcPr>
+            <w:tcW w:w="0" w:type="auto"/>
+            <w:hideMark/>
+          </w:tcPr>
+          <w:p>
+            <w:r>
+              <w:t xml:space="preserve">Integrates </w:t>
             </w:r>
             <w:r>
               <w:rPr>
                 <w:rStyle w:val="Strong"/>
                 <w:rFonts w:eastAsiaTheme="majorEastAsia"/>
               </w:rPr>
-              <w:t>predictive control or intelligent scheduling</w:t>
-            </w:r>
-            <w:r>
-              <w:t>; system is fully reactive</w:t>
+              <w:t>weather forecast/rain prediction</w:t>
+            </w:r>
+            <w:r>
+              <w:t xml:space="preserve"> to avoid unnecessary irrigation</w:t>
+            </w:r>
+          </w:p>
+        </w:tc>
+        <w:tc>
+          <w:tcPr>
+            <w:tcW w:w="0" w:type="auto"/>
+            <w:hideMark/>
+          </w:tcPr>
+          <w:p>
+            <w:r>
+              <w:t>Lacks environmental data fusion for optimal water usage</w:t>
             </w:r>
           </w:p>
         </w:tc>
@@ -16223,50 +16049,57 @@
           </w:tcPr>
           <w:p>
             <w:r>
-              <w:t>Rain Forecasting</w:t>
-            </w:r>
-          </w:p>
-        </w:tc>
-        <w:tc>
-          <w:tcPr>
-            <w:tcW w:w="0" w:type="auto"/>
-            <w:hideMark/>
-          </w:tcPr>
-          <w:p>
-            <w:r>
-              <w:t>Not integrated; decisions made solely on current water level</w:t>
-            </w:r>
-          </w:p>
-        </w:tc>
-        <w:tc>
-          <w:tcPr>
-            <w:tcW w:w="0" w:type="auto"/>
-            <w:hideMark/>
-          </w:tcPr>
-          <w:p>
-            <w:r>
-              <w:t xml:space="preserve">Integrates </w:t>
+              <w:t>Irrigation Need Estimation</w:t>
+            </w:r>
+          </w:p>
+        </w:tc>
+        <w:tc>
+          <w:tcPr>
+            <w:tcW w:w="0" w:type="auto"/>
+            <w:hideMark/>
+          </w:tcPr>
+          <w:p>
+            <w:r>
+              <w:t>Gate controlled when level exceeds 5 cm; no moisture or evapotranspiration logic</w:t>
+            </w:r>
+          </w:p>
+        </w:tc>
+        <w:tc>
+          <w:tcPr>
+            <w:tcW w:w="0" w:type="auto"/>
+            <w:hideMark/>
+          </w:tcPr>
+          <w:p>
+            <w:r>
+              <w:t xml:space="preserve">Predicts </w:t>
             </w:r>
             <w:r>
               <w:rPr>
                 <w:rStyle w:val="Strong"/>
                 <w:rFonts w:eastAsiaTheme="majorEastAsia"/>
               </w:rPr>
-              <w:t>weather forecast/rain prediction</w:t>
-            </w:r>
-            <w:r>
-              <w:t xml:space="preserve"> to avoid unnecessary irrigation</w:t>
-            </w:r>
-          </w:p>
-        </w:tc>
-        <w:tc>
-          <w:tcPr>
-            <w:tcW w:w="0" w:type="auto"/>
-            <w:hideMark/>
-          </w:tcPr>
-          <w:p>
-            <w:r>
-              <w:t>Lacks environmental data fusion for optimal water usage</w:t>
+              <w:t>how much water is needed and when</w:t>
+            </w:r>
+            <w:r>
+              <w:t xml:space="preserve"> based on </w:t>
+            </w:r>
+            <w:r>
+              <w:rPr>
+                <w:rStyle w:val="Strong"/>
+                <w:rFonts w:eastAsiaTheme="majorEastAsia"/>
+              </w:rPr>
+              <w:t>soil + weather + crop</w:t>
+            </w:r>
+          </w:p>
+        </w:tc>
+        <w:tc>
+          <w:tcPr>
+            <w:tcW w:w="0" w:type="auto"/>
+            <w:hideMark/>
+          </w:tcPr>
+          <w:p>
+            <w:r>
+              <w:t>No estimation of moisture requirement; cannot adapt to crop needs</w:t>
             </w:r>
           </w:p>
         </w:tc>
@@ -16279,157 +16112,86 @@
           </w:tcPr>
           <w:p>
             <w:r>
-              <w:t>Irrigation Need Estimation</w:t>
-            </w:r>
-          </w:p>
-        </w:tc>
-        <w:tc>
-          <w:tcPr>
-            <w:tcW w:w="0" w:type="auto"/>
-            <w:hideMark/>
-          </w:tcPr>
-          <w:p>
-            <w:r>
-              <w:t xml:space="preserve">Gate controlled when level exceeds 5 </w:t>
-            </w:r>
-            <w:proofErr w:type="gramStart"/>
-            <w:r>
-              <w:t>cm;</w:t>
-            </w:r>
-            <w:proofErr w:type="gramEnd"/>
-            <w:r>
-              <w:t xml:space="preserve"> no moisture or evapotranspiration logic</w:t>
-            </w:r>
-          </w:p>
-        </w:tc>
-        <w:tc>
-          <w:tcPr>
-            <w:tcW w:w="0" w:type="auto"/>
-            <w:hideMark/>
-          </w:tcPr>
-          <w:p>
-            <w:r>
-              <w:t xml:space="preserve">Predicts </w:t>
+              <w:lastRenderedPageBreak/>
+              <w:t>Automation Level</w:t>
+            </w:r>
+          </w:p>
+        </w:tc>
+        <w:tc>
+          <w:tcPr>
+            <w:tcW w:w="0" w:type="auto"/>
+            <w:hideMark/>
+          </w:tcPr>
+          <w:p>
+            <w:r>
+              <w:t>Partially automated via SMS/web buttons</w:t>
+            </w:r>
+          </w:p>
+        </w:tc>
+        <w:tc>
+          <w:tcPr>
+            <w:tcW w:w="0" w:type="auto"/>
+            <w:hideMark/>
+          </w:tcPr>
+          <w:p>
+            <w:r>
+              <w:t>Fully autonomous system that closes loop from sensor → prediction → actuation</w:t>
+            </w:r>
+          </w:p>
+        </w:tc>
+        <w:tc>
+          <w:tcPr>
+            <w:tcW w:w="0" w:type="auto"/>
+            <w:hideMark/>
+          </w:tcPr>
+          <w:p>
+            <w:r>
+              <w:t xml:space="preserve">Still dependent on </w:t>
             </w:r>
             <w:r>
               <w:rPr>
                 <w:rStyle w:val="Strong"/>
                 <w:rFonts w:eastAsiaTheme="majorEastAsia"/>
               </w:rPr>
-              <w:t>how much water is needed and when</w:t>
-            </w:r>
-            <w:r>
-              <w:t xml:space="preserve"> based on </w:t>
+              <w:t>human input for triggering actions</w:t>
+            </w:r>
+          </w:p>
+        </w:tc>
+      </w:tr>
+      <w:tr>
+        <w:tc>
+          <w:tcPr>
+            <w:tcW w:w="0" w:type="auto"/>
+          </w:tcPr>
+          <w:p>
+            <w:r>
+              <w:t>Scalability</w:t>
+            </w:r>
+          </w:p>
+        </w:tc>
+        <w:tc>
+          <w:tcPr>
+            <w:tcW w:w="0" w:type="auto"/>
+          </w:tcPr>
+          <w:p>
+            <w:r>
+              <w:t>Designed for single village (Bali)</w:t>
+            </w:r>
+          </w:p>
+        </w:tc>
+        <w:tc>
+          <w:tcPr>
+            <w:tcW w:w="0" w:type="auto"/>
+          </w:tcPr>
+          <w:p>
+            <w:r>
+              <w:t xml:space="preserve">Designed for </w:t>
             </w:r>
             <w:r>
               <w:rPr>
                 <w:rStyle w:val="Strong"/>
                 <w:rFonts w:eastAsiaTheme="majorEastAsia"/>
               </w:rPr>
-              <w:t>soil + weather + crop</w:t>
-            </w:r>
-          </w:p>
-        </w:tc>
-        <w:tc>
-          <w:tcPr>
-            <w:tcW w:w="0" w:type="auto"/>
-            <w:hideMark/>
-          </w:tcPr>
-          <w:p>
-            <w:r>
-              <w:t>No estimation of moisture requirement; cannot adapt to crop needs</w:t>
-            </w:r>
-          </w:p>
-        </w:tc>
-      </w:tr>
-      <w:tr>
-        <w:tc>
-          <w:tcPr>
-            <w:tcW w:w="0" w:type="auto"/>
-            <w:hideMark/>
-          </w:tcPr>
-          <w:p>
-            <w:r>
-              <w:lastRenderedPageBreak/>
-              <w:t>Automation Level</w:t>
-            </w:r>
-          </w:p>
-        </w:tc>
-        <w:tc>
-          <w:tcPr>
-            <w:tcW w:w="0" w:type="auto"/>
-            <w:hideMark/>
-          </w:tcPr>
-          <w:p>
-            <w:r>
-              <w:t>Partially automated via SMS/web buttons</w:t>
-            </w:r>
-          </w:p>
-        </w:tc>
-        <w:tc>
-          <w:tcPr>
-            <w:tcW w:w="0" w:type="auto"/>
-            <w:hideMark/>
-          </w:tcPr>
-          <w:p>
-            <w:r>
-              <w:t>Fully autonomous system that closes loop from sensor → prediction → actuation</w:t>
-            </w:r>
-          </w:p>
-        </w:tc>
-        <w:tc>
-          <w:tcPr>
-            <w:tcW w:w="0" w:type="auto"/>
-            <w:hideMark/>
-          </w:tcPr>
-          <w:p>
-            <w:r>
-              <w:t xml:space="preserve">Still dependent on </w:t>
-            </w:r>
-            <w:r>
-              <w:rPr>
-                <w:rStyle w:val="Strong"/>
-                <w:rFonts w:eastAsiaTheme="majorEastAsia"/>
-              </w:rPr>
-              <w:t>human input for triggering actions</w:t>
-            </w:r>
-          </w:p>
-        </w:tc>
-      </w:tr>
-      <w:tr>
-        <w:tc>
-          <w:tcPr>
-            <w:tcW w:w="0" w:type="auto"/>
-          </w:tcPr>
-          <w:p>
-            <w:r>
-              <w:t>Scalability</w:t>
-            </w:r>
-          </w:p>
-        </w:tc>
-        <w:tc>
-          <w:tcPr>
-            <w:tcW w:w="0" w:type="auto"/>
-          </w:tcPr>
-          <w:p>
-            <w:r>
-              <w:t>Designed for single village (Bali)</w:t>
-            </w:r>
-          </w:p>
-        </w:tc>
-        <w:tc>
-          <w:tcPr>
-            <w:tcW w:w="0" w:type="auto"/>
-          </w:tcPr>
-          <w:p>
-            <w:r>
-              <w:t xml:space="preserve">Designed for </w:t>
-            </w:r>
-            <w:r>
-              <w:rPr>
-                <w:rStyle w:val="Strong"/>
-                <w:rFonts w:eastAsiaTheme="majorEastAsia"/>
-              </w:rPr>
               <w:t>wider paddy deployments in Sri Lanka</w:t>
             </w:r>
           </w:p>
@@ -16487,13 +16249,8 @@
         </w:numPr>
         <w:spacing w:before="100" w:beforeAutospacing="1" w:after="100" w:afterAutospacing="1"/>
       </w:pPr>
-      <w:proofErr w:type="gramStart"/>
-      <w:r>
-        <w:t>Uses</w:t>
-      </w:r>
-      <w:proofErr w:type="gramEnd"/>
-      <w:r>
-        <w:t xml:space="preserve"> </w:t>
+      <w:r>
+        <w:t xml:space="preserve">Uses </w:t>
       </w:r>
       <w:r>
         <w:rPr>
@@ -16578,13 +16335,8 @@
         </w:numPr>
         <w:spacing w:before="100" w:beforeAutospacing="1" w:after="100" w:afterAutospacing="1"/>
       </w:pPr>
-      <w:proofErr w:type="gramStart"/>
-      <w:r>
-        <w:t>Allows for</w:t>
-      </w:r>
-      <w:proofErr w:type="gramEnd"/>
-      <w:r>
-        <w:t xml:space="preserve"> </w:t>
+      <w:r>
+        <w:t xml:space="preserve">Allows for </w:t>
       </w:r>
       <w:r>
         <w:rPr>
@@ -16641,15 +16393,7 @@
         <w:t>6</w:t>
       </w:r>
       <w:r>
-        <w:t xml:space="preserve"> - Design and Control System of Sluice Gate </w:t>
-      </w:r>
-      <w:proofErr w:type="gramStart"/>
-      <w:r>
-        <w:t>With</w:t>
-      </w:r>
-      <w:proofErr w:type="gramEnd"/>
-      <w:r>
-        <w:t xml:space="preserve"> Web-Based Information</w:t>
+        <w:t xml:space="preserve"> - Design and Control System of Sluice Gate With Web-Based Information</w:t>
       </w:r>
     </w:p>
     <w:p>
@@ -18467,15 +18211,7 @@
           </w:tcPr>
           <w:p>
             <w:r>
-              <w:t xml:space="preserve">Rainfall </w:t>
-            </w:r>
-            <w:proofErr w:type="gramStart"/>
-            <w:r>
-              <w:t>only</w:t>
-            </w:r>
-            <w:proofErr w:type="gramEnd"/>
-            <w:r>
-              <w:t xml:space="preserve"> recorded manually; not used to delay or skip irrigation</w:t>
+              <w:t>Rainfall only recorded manually; not used to delay or skip irrigation</w:t>
             </w:r>
           </w:p>
         </w:tc>
@@ -18506,13 +18242,8 @@
             <w:hideMark/>
           </w:tcPr>
           <w:p>
-            <w:proofErr w:type="gramStart"/>
-            <w:r>
-              <w:t>Misses</w:t>
-            </w:r>
-            <w:proofErr w:type="gramEnd"/>
-            <w:r>
-              <w:t xml:space="preserve"> opportunity to conserve water during natural rainfall</w:t>
+            <w:r>
+              <w:t>Misses opportunity to conserve water during natural rainfall</w:t>
             </w:r>
           </w:p>
         </w:tc>
@@ -19074,23 +18805,7 @@
           <w:b/>
           <w:bCs/>
         </w:rPr>
-        <w:t>reference evapotranspiration (</w:t>
-      </w:r>
-      <w:proofErr w:type="spellStart"/>
-      <w:r>
-        <w:rPr>
-          <w:b/>
-          <w:bCs/>
-        </w:rPr>
-        <w:t>ETo</w:t>
-      </w:r>
-      <w:proofErr w:type="spellEnd"/>
-      <w:r>
-        <w:rPr>
-          <w:b/>
-          <w:bCs/>
-        </w:rPr>
-        <w:t>)</w:t>
+        <w:t>reference evapotranspiration (ETo)</w:t>
       </w:r>
       <w:r>
         <w:t>.</w:t>
@@ -19122,23 +18837,7 @@
           <w:b/>
           <w:bCs/>
         </w:rPr>
-        <w:t>crop evapotranspiration (</w:t>
-      </w:r>
-      <w:proofErr w:type="spellStart"/>
-      <w:r>
-        <w:rPr>
-          <w:b/>
-          <w:bCs/>
-        </w:rPr>
-        <w:t>ETcrop</w:t>
-      </w:r>
-      <w:proofErr w:type="spellEnd"/>
-      <w:r>
-        <w:rPr>
-          <w:b/>
-          <w:bCs/>
-        </w:rPr>
-        <w:t>)</w:t>
+        <w:t>crop evapotranspiration (ETcrop)</w:t>
       </w:r>
       <w:r>
         <w:t>.</w:t>
@@ -19226,15 +18925,7 @@
         <w:spacing w:before="100" w:beforeAutospacing="1" w:after="100" w:afterAutospacing="1"/>
       </w:pPr>
       <w:r>
-        <w:t xml:space="preserve">Maximum </w:t>
-      </w:r>
-      <w:proofErr w:type="spellStart"/>
-      <w:r>
-        <w:t>ETo</w:t>
-      </w:r>
-      <w:proofErr w:type="spellEnd"/>
-      <w:r>
-        <w:t>: May (5.28 mm/day); Minimum: January (1.43 mm/day).</w:t>
+        <w:t>Maximum ETo: May (5.28 mm/day); Minimum: January (1.43 mm/day).</w:t>
       </w:r>
     </w:p>
     <w:p>
@@ -19562,15 +19253,7 @@
           </w:tcPr>
           <w:p>
             <w:r>
-              <w:t xml:space="preserve">Planning </w:t>
-            </w:r>
-            <w:proofErr w:type="gramStart"/>
-            <w:r>
-              <w:t>tool</w:t>
-            </w:r>
-            <w:proofErr w:type="gramEnd"/>
-            <w:r>
-              <w:t xml:space="preserve"> for humans to manually irrigate</w:t>
+              <w:t>Planning tool for humans to manually irrigate</w:t>
             </w:r>
           </w:p>
         </w:tc>
@@ -20054,15 +19737,7 @@
         <w:t>Published In</w:t>
       </w:r>
       <w:r>
-        <w:t xml:space="preserve">: </w:t>
-      </w:r>
-      <w:proofErr w:type="spellStart"/>
-      <w:r>
-        <w:t>arXiv</w:t>
-      </w:r>
-      <w:proofErr w:type="spellEnd"/>
-      <w:r>
-        <w:t xml:space="preserve"> (2023)</w:t>
+        <w:t>: arXiv (2023)</w:t>
       </w:r>
     </w:p>
     <w:p>
@@ -20310,15 +19985,7 @@
         <w:t>action space</w:t>
       </w:r>
       <w:r>
-        <w:t xml:space="preserve"> is </w:t>
-      </w:r>
-      <w:proofErr w:type="gramStart"/>
-      <w:r>
-        <w:t>discrete</w:t>
-      </w:r>
-      <w:proofErr w:type="gramEnd"/>
-      <w:r>
-        <w:t xml:space="preserve">, allowing the agent to choose one of </w:t>
+        <w:t xml:space="preserve"> is discrete, allowing the agent to choose one of </w:t>
       </w:r>
       <w:r>
         <w:rPr>
@@ -20369,39 +20036,7 @@
         <w:ind w:left="1440"/>
       </w:pPr>
       <w:r>
-        <w:t>Reward=Grain Revenue−Irrigation Cost\</w:t>
-      </w:r>
-      <w:proofErr w:type="gramStart"/>
-      <w:r>
-        <w:t>text{</w:t>
-      </w:r>
-      <w:proofErr w:type="gramEnd"/>
-      <w:r>
-        <w:t>Reward} = \</w:t>
-      </w:r>
-      <w:proofErr w:type="gramStart"/>
-      <w:r>
-        <w:t>text{</w:t>
-      </w:r>
-      <w:proofErr w:type="gramEnd"/>
-      <w:r>
-        <w:t>Grain Revenue} - \</w:t>
-      </w:r>
-      <w:proofErr w:type="gramStart"/>
-      <w:r>
-        <w:t>text{</w:t>
-      </w:r>
-      <w:proofErr w:type="gramEnd"/>
-      <w:r>
-        <w:t xml:space="preserve">Irrigation </w:t>
-      </w:r>
-      <w:proofErr w:type="gramStart"/>
-      <w:r>
-        <w:t>Cost}Reward</w:t>
-      </w:r>
-      <w:proofErr w:type="gramEnd"/>
-      <w:r>
-        <w:t xml:space="preserve">=Grain Revenue−Irrigation Cost </w:t>
+        <w:t xml:space="preserve">Reward=Grain Revenue−Irrigation Cost\text{Reward} = \text{Grain Revenue} - \text{Irrigation Cost}Reward=Grain Revenue−Irrigation Cost </w:t>
       </w:r>
     </w:p>
     <w:p>
@@ -20467,15 +20102,7 @@
         <w:spacing w:before="100" w:beforeAutospacing="1" w:after="100" w:afterAutospacing="1"/>
       </w:pPr>
       <w:r>
-        <w:t xml:space="preserve">The network outputs a probability distribution over possible irrigation </w:t>
-      </w:r>
-      <w:proofErr w:type="gramStart"/>
-      <w:r>
-        <w:t>actions</w:t>
-      </w:r>
-      <w:proofErr w:type="gramEnd"/>
-      <w:r>
-        <w:t>.</w:t>
+        <w:t>The network outputs a probability distribution over possible irrigation actions.</w:t>
       </w:r>
     </w:p>
     <w:p>
@@ -20487,15 +20114,7 @@
         <w:spacing w:before="100" w:beforeAutospacing="1" w:after="100" w:afterAutospacing="1"/>
       </w:pPr>
       <w:r>
-        <w:t xml:space="preserve">The model is </w:t>
-      </w:r>
-      <w:proofErr w:type="gramStart"/>
-      <w:r>
-        <w:t>trained</w:t>
-      </w:r>
-      <w:proofErr w:type="gramEnd"/>
-      <w:r>
-        <w:t xml:space="preserve"> over </w:t>
+        <w:t xml:space="preserve">The model is trained over </w:t>
       </w:r>
       <w:r>
         <w:rPr>
@@ -21382,21 +21001,8 @@
         <w:t>Authors</w:t>
       </w:r>
       <w:r>
-        <w:t xml:space="preserve">: </w:t>
-      </w:r>
-      <w:proofErr w:type="spellStart"/>
-      <w:r>
-        <w:t>Manikumari</w:t>
-      </w:r>
-      <w:proofErr w:type="spellEnd"/>
-      <w:r>
-        <w:t xml:space="preserve"> Nagappan, Swetha Jayamurugan, Aarthika </w:t>
-      </w:r>
-      <w:proofErr w:type="spellStart"/>
-      <w:r>
-        <w:t>Kudiarasumani</w:t>
-      </w:r>
-      <w:proofErr w:type="spellEnd"/>
+        <w:t>: Manikumari Nagappan, Swetha Jayamurugan, Aarthika Kudiarasumani</w:t>
+      </w:r>
     </w:p>
     <w:p>
       <w:pPr>
@@ -21472,23 +21078,7 @@
           <w:b/>
           <w:bCs/>
         </w:rPr>
-        <w:t>Evapotranspiration (</w:t>
-      </w:r>
-      <w:proofErr w:type="spellStart"/>
-      <w:r>
-        <w:rPr>
-          <w:b/>
-          <w:bCs/>
-        </w:rPr>
-        <w:t>ETo</w:t>
-      </w:r>
-      <w:proofErr w:type="spellEnd"/>
-      <w:r>
-        <w:rPr>
-          <w:b/>
-          <w:bCs/>
-        </w:rPr>
-        <w:t>)</w:t>
+        <w:t>Evapotranspiration (ETo)</w:t>
       </w:r>
       <w:r>
         <w:t xml:space="preserve"> using meteorological parameters.</w:t>
@@ -22077,13 +21667,8 @@
             <w:hideMark/>
           </w:tcPr>
           <w:p>
-            <w:proofErr w:type="gramStart"/>
-            <w:r>
-              <w:t>Relies</w:t>
-            </w:r>
-            <w:proofErr w:type="gramEnd"/>
-            <w:r>
-              <w:t xml:space="preserve"> on user-entered weather data</w:t>
+            <w:r>
+              <w:t>Relies on user-entered weather data</w:t>
             </w:r>
           </w:p>
         </w:tc>
@@ -22139,31 +21724,18 @@
           </w:tcPr>
           <w:p>
             <w:r>
-              <w:t xml:space="preserve">Provides predicted </w:t>
-            </w:r>
-            <w:proofErr w:type="spellStart"/>
-            <w:r>
-              <w:t>ETo</w:t>
-            </w:r>
-            <w:proofErr w:type="spellEnd"/>
-            <w:r>
-              <w:t xml:space="preserve"> or CWR; irrigation left to user</w:t>
-            </w:r>
-          </w:p>
-        </w:tc>
-        <w:tc>
-          <w:tcPr>
-            <w:tcW w:w="0" w:type="auto"/>
-            <w:hideMark/>
-          </w:tcPr>
-          <w:p>
-            <w:proofErr w:type="gramStart"/>
-            <w:r>
-              <w:t>Calculates</w:t>
-            </w:r>
-            <w:proofErr w:type="gramEnd"/>
-            <w:r>
-              <w:t xml:space="preserve"> and executes required irrigation volume</w:t>
+              <w:t>Provides predicted ETo or CWR; irrigation left to user</w:t>
+            </w:r>
+          </w:p>
+        </w:tc>
+        <w:tc>
+          <w:tcPr>
+            <w:tcW w:w="0" w:type="auto"/>
+            <w:hideMark/>
+          </w:tcPr>
+          <w:p>
+            <w:r>
+              <w:t>Calculates and executes required irrigation volume</w:t>
             </w:r>
           </w:p>
         </w:tc>
@@ -22586,7 +22158,27 @@
             <w:sz w:val="27"/>
             <w:szCs w:val="27"/>
           </w:rPr>
-          <w:t>https://drive.google.com/file/d/1ee0iXyMEcmzzPTYA2x6Zf1yXRyaQ2LN_/view?usp=drive_link</w:t>
+          <w:t>https://dri</w:t>
+        </w:r>
+        <w:r>
+          <w:rPr>
+            <w:rStyle w:val="Hyperlink"/>
+            <w:b/>
+            <w:bCs/>
+            <w:sz w:val="27"/>
+            <w:szCs w:val="27"/>
+          </w:rPr>
+          <w:t>v</w:t>
+        </w:r>
+        <w:r>
+          <w:rPr>
+            <w:rStyle w:val="Hyperlink"/>
+            <w:b/>
+            <w:bCs/>
+            <w:sz w:val="27"/>
+            <w:szCs w:val="27"/>
+          </w:rPr>
+          <w:t>e.google.com/file/d/1ee0iXyMEcmzzPTYA2x6Zf1yXRyaQ2LN_/view?usp=drive_link</w:t>
         </w:r>
       </w:hyperlink>
     </w:p>
@@ -22637,13 +22229,8 @@
         <w:t>Authors</w:t>
       </w:r>
       <w:r>
-        <w:t xml:space="preserve">: Ahmed Awad, Luo Wan, Mustafa El-Rawy, Mohamed Galal </w:t>
-      </w:r>
-      <w:proofErr w:type="spellStart"/>
-      <w:r>
-        <w:t>Eltarabily</w:t>
-      </w:r>
-      <w:proofErr w:type="spellEnd"/>
+        <w:t>: Ahmed Awad, Luo Wan, Mustafa El-Rawy, Mohamed Galal Eltarabily</w:t>
+      </w:r>
     </w:p>
     <w:p>
       <w:pPr>
@@ -22762,15 +22349,7 @@
         <w:t>DRAINMOD</w:t>
       </w:r>
       <w:r>
-        <w:t xml:space="preserve">: Hydrology simulator that </w:t>
-      </w:r>
-      <w:proofErr w:type="gramStart"/>
-      <w:r>
-        <w:t>models</w:t>
-      </w:r>
-      <w:proofErr w:type="gramEnd"/>
-      <w:r>
-        <w:t xml:space="preserve"> infiltration, runoff, and drainage flux under real field conditions.</w:t>
+        <w:t>: Hydrology simulator that models infiltration, runoff, and drainage flux under real field conditions.</w:t>
       </w:r>
     </w:p>
     <w:p>
@@ -23646,15 +23225,7 @@
         <w:t xml:space="preserve"> - </w:t>
       </w:r>
       <w:r>
-        <w:t>IoT-Driven Smart Irrigation for Paddy Cultivation using BCO-</w:t>
-      </w:r>
-      <w:proofErr w:type="spellStart"/>
-      <w:r>
-        <w:t>ResNet</w:t>
-      </w:r>
-      <w:proofErr w:type="spellEnd"/>
-      <w:r>
-        <w:t>: A Deep Learning Approach</w:t>
+        <w:t>IoT-Driven Smart Irrigation for Paddy Cultivation using BCO-ResNet: A Deep Learning Approach</w:t>
       </w:r>
     </w:p>
     <w:p>
@@ -23694,7 +23265,19 @@
           <w:rPr>
             <w:rStyle w:val="Hyperlink"/>
           </w:rPr>
-          <w:t>https://ieeexplore.ieee.org/document/10940266</w:t>
+          <w:t>https://ieeexplore.ieee.org/doc</w:t>
+        </w:r>
+        <w:r>
+          <w:rPr>
+            <w:rStyle w:val="Hyperlink"/>
+          </w:rPr>
+          <w:t>u</w:t>
+        </w:r>
+        <w:r>
+          <w:rPr>
+            <w:rStyle w:val="Hyperlink"/>
+          </w:rPr>
+          <w:t>ment/10940266</w:t>
         </w:r>
       </w:hyperlink>
     </w:p>
@@ -23772,55 +23355,39 @@
           <w:i/>
           <w:iCs/>
         </w:rPr>
-        <w:t>IoT-Driven Smart Irrigation for Paddy Cultivation using BCO-</w:t>
-      </w:r>
-      <w:proofErr w:type="spellStart"/>
+        <w:t>IoT-Driven Smart Irrigation for Paddy Cultivation using BCO-ResNet: A Deep Learning Approach</w:t>
+      </w:r>
+      <w:r>
+        <w:br/>
+      </w:r>
+      <w:r>
+        <w:rPr>
+          <w:b/>
+          <w:bCs/>
+        </w:rPr>
+        <w:t>Authors:</w:t>
+      </w:r>
+      <w:r>
+        <w:t xml:space="preserve"> R. Anbarasu and V. Parthipan</w:t>
+      </w:r>
+      <w:r>
+        <w:br/>
+      </w:r>
+      <w:r>
+        <w:rPr>
+          <w:b/>
+          <w:bCs/>
+        </w:rPr>
+        <w:t>Published in:</w:t>
+      </w:r>
+      <w:r>
+        <w:t xml:space="preserve"> </w:t>
+      </w:r>
       <w:r>
         <w:rPr>
           <w:i/>
           <w:iCs/>
         </w:rPr>
-        <w:t>ResNet</w:t>
-      </w:r>
-      <w:proofErr w:type="spellEnd"/>
-      <w:r>
-        <w:rPr>
-          <w:i/>
-          <w:iCs/>
-        </w:rPr>
-        <w:t>: A Deep Learning Approach</w:t>
-      </w:r>
-      <w:r>
-        <w:br/>
-      </w:r>
-      <w:r>
-        <w:rPr>
-          <w:b/>
-          <w:bCs/>
-        </w:rPr>
-        <w:t>Authors:</w:t>
-      </w:r>
-      <w:r>
-        <w:t xml:space="preserve"> R. Anbarasu and V. Parthipan</w:t>
-      </w:r>
-      <w:r>
-        <w:br/>
-      </w:r>
-      <w:r>
-        <w:rPr>
-          <w:b/>
-          <w:bCs/>
-        </w:rPr>
-        <w:t>Published in:</w:t>
-      </w:r>
-      <w:r>
-        <w:t xml:space="preserve"> </w:t>
-      </w:r>
-      <w:r>
-        <w:rPr>
-          <w:i/>
-          <w:iCs/>
-        </w:rPr>
         <w:t>Proceedings of the International Conference on Electronics and Renewable Systems (ICEARS 2025), IEEE</w:t>
       </w:r>
     </w:p>
@@ -23857,55 +23424,7 @@
           <w:b/>
           <w:bCs/>
         </w:rPr>
-        <w:t xml:space="preserve">Bee Colony </w:t>
-      </w:r>
-      <w:proofErr w:type="spellStart"/>
-      <w:r>
-        <w:rPr>
-          <w:b/>
-          <w:bCs/>
-        </w:rPr>
-        <w:t>Optimisation</w:t>
-      </w:r>
-      <w:proofErr w:type="spellEnd"/>
-      <w:r>
-        <w:rPr>
-          <w:b/>
-          <w:bCs/>
-        </w:rPr>
-        <w:t>–</w:t>
-      </w:r>
-      <w:proofErr w:type="spellStart"/>
-      <w:r>
-        <w:rPr>
-          <w:b/>
-          <w:bCs/>
-        </w:rPr>
-        <w:t>ResNet</w:t>
-      </w:r>
-      <w:proofErr w:type="spellEnd"/>
-      <w:r>
-        <w:rPr>
-          <w:b/>
-          <w:bCs/>
-        </w:rPr>
-        <w:t xml:space="preserve"> (BCO-</w:t>
-      </w:r>
-      <w:proofErr w:type="spellStart"/>
-      <w:r>
-        <w:rPr>
-          <w:b/>
-          <w:bCs/>
-        </w:rPr>
-        <w:t>ResNet</w:t>
-      </w:r>
-      <w:proofErr w:type="spellEnd"/>
-      <w:r>
-        <w:rPr>
-          <w:b/>
-          <w:bCs/>
-        </w:rPr>
-        <w:t>)</w:t>
+        <w:t>Bee Colony Optimisation–ResNet (BCO-ResNet)</w:t>
       </w:r>
       <w:r>
         <w:t xml:space="preserve"> model to improve irrigation management in paddy fields using </w:t>
@@ -23954,23 +23473,7 @@
           <w:b/>
           <w:bCs/>
         </w:rPr>
-        <w:t>IoT-BCO-</w:t>
-      </w:r>
-      <w:proofErr w:type="spellStart"/>
-      <w:r>
-        <w:rPr>
-          <w:b/>
-          <w:bCs/>
-        </w:rPr>
-        <w:t>ResNet</w:t>
-      </w:r>
-      <w:proofErr w:type="spellEnd"/>
-      <w:r>
-        <w:rPr>
-          <w:b/>
-          <w:bCs/>
-        </w:rPr>
-        <w:t xml:space="preserve"> system</w:t>
+        <w:t>IoT-BCO-ResNet system</w:t>
       </w:r>
       <w:r>
         <w:t xml:space="preserve"> integrates:</w:t>
@@ -24008,23 +23511,7 @@
           <w:b/>
           <w:bCs/>
         </w:rPr>
-        <w:t xml:space="preserve">BCO (Bee Colony </w:t>
-      </w:r>
-      <w:proofErr w:type="spellStart"/>
-      <w:r>
-        <w:rPr>
-          <w:b/>
-          <w:bCs/>
-        </w:rPr>
-        <w:t>Optimisation</w:t>
-      </w:r>
-      <w:proofErr w:type="spellEnd"/>
-      <w:r>
-        <w:rPr>
-          <w:b/>
-          <w:bCs/>
-        </w:rPr>
-        <w:t>):</w:t>
+        <w:t>BCO (Bee Colony Optimisation):</w:t>
       </w:r>
       <w:r>
         <w:t xml:space="preserve"> Performs feature selection and hyperparameter tuning to select the most relevant features (e.g., soil moisture, temperature).</w:t>
@@ -24038,32 +23525,15 @@
         </w:numPr>
         <w:spacing w:before="100" w:beforeAutospacing="1" w:after="100" w:afterAutospacing="1"/>
       </w:pPr>
-      <w:proofErr w:type="spellStart"/>
-      <w:r>
-        <w:rPr>
-          <w:b/>
-          <w:bCs/>
-        </w:rPr>
-        <w:t>ResNet</w:t>
-      </w:r>
-      <w:proofErr w:type="spellEnd"/>
-      <w:r>
-        <w:rPr>
-          <w:b/>
-          <w:bCs/>
-        </w:rPr>
-        <w:t xml:space="preserve"> (Residual Neural Network):</w:t>
-      </w:r>
-      <w:r>
-        <w:t xml:space="preserve"> Deep learning model that predicts irrigation demand based on </w:t>
-      </w:r>
-      <w:proofErr w:type="spellStart"/>
-      <w:r>
-        <w:t>optimised</w:t>
-      </w:r>
-      <w:proofErr w:type="spellEnd"/>
-      <w:r>
-        <w:t xml:space="preserve"> input features.</w:t>
+      <w:r>
+        <w:rPr>
+          <w:b/>
+          <w:bCs/>
+        </w:rPr>
+        <w:t>ResNet (Residual Neural Network):</w:t>
+      </w:r>
+      <w:r>
+        <w:t xml:space="preserve"> Deep learning model that predicts irrigation demand based on optimised input features.</w:t>
       </w:r>
     </w:p>
     <w:p>
@@ -24141,15 +23611,7 @@
         <w:t>Pre-processing:</w:t>
       </w:r>
       <w:r>
-        <w:t xml:space="preserve"> Cleansing, </w:t>
-      </w:r>
-      <w:proofErr w:type="spellStart"/>
-      <w:r>
-        <w:t>normalisation</w:t>
-      </w:r>
-      <w:proofErr w:type="spellEnd"/>
-      <w:r>
-        <w:t>, and outlier removal.</w:t>
+        <w:t xml:space="preserve"> Cleansing, normalisation, and outlier removal.</w:t>
       </w:r>
     </w:p>
     <w:p>
@@ -24188,15 +23650,7 @@
         <w:t>Model Training:</w:t>
       </w:r>
       <w:r>
-        <w:t xml:space="preserve"> </w:t>
-      </w:r>
-      <w:proofErr w:type="spellStart"/>
-      <w:r>
-        <w:t>ResNet</w:t>
-      </w:r>
-      <w:proofErr w:type="spellEnd"/>
-      <w:r>
-        <w:t xml:space="preserve"> learns irrigation demand patterns using historical data.</w:t>
+        <w:t xml:space="preserve"> ResNet learns irrigation demand patterns using historical data.</w:t>
       </w:r>
     </w:p>
     <w:p>
@@ -24475,19 +23929,26 @@
                 <w:sz w:val="27"/>
                 <w:szCs w:val="27"/>
               </w:rPr>
-              <w:t>BCO-</w:t>
-            </w:r>
-            <w:proofErr w:type="spellStart"/>
-            <w:r>
+              <w:t>BCO-ResNet (Proposed)</w:t>
+            </w:r>
+          </w:p>
+        </w:tc>
+      </w:tr>
+      <w:tr>
+        <w:tc>
+          <w:tcPr>
+            <w:tcW w:w="0" w:type="auto"/>
+            <w:hideMark/>
+          </w:tcPr>
+          <w:p>
+            <w:pPr>
               <w:rPr>
                 <w:b/>
                 <w:bCs/>
                 <w:sz w:val="27"/>
                 <w:szCs w:val="27"/>
               </w:rPr>
-              <w:t>ResNet</w:t>
-            </w:r>
-            <w:proofErr w:type="spellEnd"/>
+            </w:pPr>
             <w:r>
               <w:rPr>
                 <w:b/>
@@ -24495,12 +23956,10 @@
                 <w:sz w:val="27"/>
                 <w:szCs w:val="27"/>
               </w:rPr>
-              <w:t xml:space="preserve"> (Proposed)</w:t>
-            </w:r>
-          </w:p>
-        </w:tc>
-      </w:tr>
-      <w:tr>
+              <w:t>Accuracy</w:t>
+            </w:r>
+          </w:p>
+        </w:tc>
         <w:tc>
           <w:tcPr>
             <w:tcW w:w="0" w:type="auto"/>
@@ -24522,7 +23981,7 @@
                 <w:sz w:val="27"/>
                 <w:szCs w:val="27"/>
               </w:rPr>
-              <w:t>Accuracy</w:t>
+              <w:t>78.2%</w:t>
             </w:r>
           </w:p>
         </w:tc>
@@ -24547,7 +24006,7 @@
                 <w:sz w:val="27"/>
                 <w:szCs w:val="27"/>
               </w:rPr>
-              <w:t>78.2%</w:t>
+              <w:t>80.5%</w:t>
             </w:r>
           </w:p>
         </w:tc>
@@ -24572,10 +24031,12 @@
                 <w:sz w:val="27"/>
                 <w:szCs w:val="27"/>
               </w:rPr>
-              <w:t>80.5%</w:t>
-            </w:r>
-          </w:p>
-        </w:tc>
+              <w:t>91.3%</w:t>
+            </w:r>
+          </w:p>
+        </w:tc>
+      </w:tr>
+      <w:tr>
         <w:tc>
           <w:tcPr>
             <w:tcW w:w="0" w:type="auto"/>
@@ -24597,12 +24058,10 @@
                 <w:sz w:val="27"/>
                 <w:szCs w:val="27"/>
               </w:rPr>
-              <w:t>91.3%</w:t>
-            </w:r>
-          </w:p>
-        </w:tc>
-      </w:tr>
-      <w:tr>
+              <w:t>Precision</w:t>
+            </w:r>
+          </w:p>
+        </w:tc>
         <w:tc>
           <w:tcPr>
             <w:tcW w:w="0" w:type="auto"/>
@@ -24624,7 +24083,7 @@
                 <w:sz w:val="27"/>
                 <w:szCs w:val="27"/>
               </w:rPr>
-              <w:t>Precision</w:t>
+              <w:t>69.5%</w:t>
             </w:r>
           </w:p>
         </w:tc>
@@ -24649,7 +24108,7 @@
                 <w:sz w:val="27"/>
                 <w:szCs w:val="27"/>
               </w:rPr>
-              <w:t>69.5%</w:t>
+              <w:t>76.0%</w:t>
             </w:r>
           </w:p>
         </w:tc>
@@ -24674,10 +24133,12 @@
                 <w:sz w:val="27"/>
                 <w:szCs w:val="27"/>
               </w:rPr>
-              <w:t>76.0%</w:t>
-            </w:r>
-          </w:p>
-        </w:tc>
+              <w:t>88.2%</w:t>
+            </w:r>
+          </w:p>
+        </w:tc>
+      </w:tr>
+      <w:tr>
         <w:tc>
           <w:tcPr>
             <w:tcW w:w="0" w:type="auto"/>
@@ -24699,12 +24160,10 @@
                 <w:sz w:val="27"/>
                 <w:szCs w:val="27"/>
               </w:rPr>
-              <w:t>88.2%</w:t>
-            </w:r>
-          </w:p>
-        </w:tc>
-      </w:tr>
-      <w:tr>
+              <w:t>Recall</w:t>
+            </w:r>
+          </w:p>
+        </w:tc>
         <w:tc>
           <w:tcPr>
             <w:tcW w:w="0" w:type="auto"/>
@@ -24726,7 +24185,7 @@
                 <w:sz w:val="27"/>
                 <w:szCs w:val="27"/>
               </w:rPr>
-              <w:t>Recall</w:t>
+              <w:t>74.0%</w:t>
             </w:r>
           </w:p>
         </w:tc>
@@ -24751,7 +24210,7 @@
                 <w:sz w:val="27"/>
                 <w:szCs w:val="27"/>
               </w:rPr>
-              <w:t>74.0%</w:t>
+              <w:t>77.5%</w:t>
             </w:r>
           </w:p>
         </w:tc>
@@ -24776,10 +24235,12 @@
                 <w:sz w:val="27"/>
                 <w:szCs w:val="27"/>
               </w:rPr>
-              <w:t>77.5%</w:t>
-            </w:r>
-          </w:p>
-        </w:tc>
+              <w:t>89.3%</w:t>
+            </w:r>
+          </w:p>
+        </w:tc>
+      </w:tr>
+      <w:tr>
         <w:tc>
           <w:tcPr>
             <w:tcW w:w="0" w:type="auto"/>
@@ -24801,12 +24262,10 @@
                 <w:sz w:val="27"/>
                 <w:szCs w:val="27"/>
               </w:rPr>
-              <w:t>89.3%</w:t>
-            </w:r>
-          </w:p>
-        </w:tc>
-      </w:tr>
-      <w:tr>
+              <w:t>F1-Score</w:t>
+            </w:r>
+          </w:p>
+        </w:tc>
         <w:tc>
           <w:tcPr>
             <w:tcW w:w="0" w:type="auto"/>
@@ -24828,7 +24287,7 @@
                 <w:sz w:val="27"/>
                 <w:szCs w:val="27"/>
               </w:rPr>
-              <w:t>F1-Score</w:t>
+              <w:t>71.6%</w:t>
             </w:r>
           </w:p>
         </w:tc>
@@ -24853,7 +24312,7 @@
                 <w:sz w:val="27"/>
                 <w:szCs w:val="27"/>
               </w:rPr>
-              <w:t>71.6%</w:t>
+              <w:t>77.8%</w:t>
             </w:r>
           </w:p>
         </w:tc>
@@ -24878,31 +24337,6 @@
                 <w:sz w:val="27"/>
                 <w:szCs w:val="27"/>
               </w:rPr>
-              <w:t>77.8%</w:t>
-            </w:r>
-          </w:p>
-        </w:tc>
-        <w:tc>
-          <w:tcPr>
-            <w:tcW w:w="0" w:type="auto"/>
-            <w:hideMark/>
-          </w:tcPr>
-          <w:p>
-            <w:pPr>
-              <w:rPr>
-                <w:b/>
-                <w:bCs/>
-                <w:sz w:val="27"/>
-                <w:szCs w:val="27"/>
-              </w:rPr>
-            </w:pPr>
-            <w:r>
-              <w:rPr>
-                <w:b/>
-                <w:bCs/>
-                <w:sz w:val="27"/>
-                <w:szCs w:val="27"/>
-              </w:rPr>
               <w:t>88.3%</w:t>
             </w:r>
           </w:p>
@@ -25038,23 +24472,7 @@
           <w:b/>
           <w:bCs/>
         </w:rPr>
-        <w:t>Hybrid BCO-</w:t>
-      </w:r>
-      <w:proofErr w:type="spellStart"/>
-      <w:r>
-        <w:rPr>
-          <w:b/>
-          <w:bCs/>
-        </w:rPr>
-        <w:t>ResNet</w:t>
-      </w:r>
-      <w:proofErr w:type="spellEnd"/>
-      <w:r>
-        <w:rPr>
-          <w:b/>
-          <w:bCs/>
-        </w:rPr>
-        <w:t xml:space="preserve"> Architecture:</w:t>
+        <w:t>Hybrid BCO-ResNet Architecture:</w:t>
       </w:r>
       <w:r>
         <w:t xml:space="preserve"> Combines deep residual learning with swarm intelligence (BCO) for improved prediction accuracy.</w:t>
@@ -25092,23 +24510,7 @@
           <w:b/>
           <w:bCs/>
         </w:rPr>
-        <w:t xml:space="preserve">Feature </w:t>
-      </w:r>
-      <w:proofErr w:type="spellStart"/>
-      <w:r>
-        <w:rPr>
-          <w:b/>
-          <w:bCs/>
-        </w:rPr>
-        <w:t>Optimisation</w:t>
-      </w:r>
-      <w:proofErr w:type="spellEnd"/>
-      <w:r>
-        <w:rPr>
-          <w:b/>
-          <w:bCs/>
-        </w:rPr>
-        <w:t>:</w:t>
+        <w:t>Feature Optimisation:</w:t>
       </w:r>
       <w:r>
         <w:t xml:space="preserve"> Automatic selection of the most influential features via BCO.</w:t>
@@ -25266,23 +24668,29 @@
                 <w:b/>
                 <w:bCs/>
               </w:rPr>
-              <w:t>BCO-</w:t>
-            </w:r>
-            <w:proofErr w:type="spellStart"/>
-            <w:r>
+              <w:t>BCO-ResNet Paper</w:t>
+            </w:r>
+          </w:p>
+        </w:tc>
+        <w:tc>
+          <w:tcPr>
+            <w:tcW w:w="0" w:type="auto"/>
+            <w:hideMark/>
+          </w:tcPr>
+          <w:p>
+            <w:pPr>
+              <w:jc w:val="center"/>
               <w:rPr>
                 <w:b/>
                 <w:bCs/>
               </w:rPr>
-              <w:t>ResNet</w:t>
-            </w:r>
-            <w:proofErr w:type="spellEnd"/>
+            </w:pPr>
             <w:r>
               <w:rPr>
                 <w:b/>
                 <w:bCs/>
               </w:rPr>
-              <w:t xml:space="preserve"> Paper</w:t>
+              <w:t>Your Smart Water Gate Project</w:t>
             </w:r>
           </w:p>
         </w:tc>
@@ -25304,28 +24712,6 @@
                 <w:b/>
                 <w:bCs/>
               </w:rPr>
-              <w:t>Your Smart Water Gate Project</w:t>
-            </w:r>
-          </w:p>
-        </w:tc>
-        <w:tc>
-          <w:tcPr>
-            <w:tcW w:w="0" w:type="auto"/>
-            <w:hideMark/>
-          </w:tcPr>
-          <w:p>
-            <w:pPr>
-              <w:jc w:val="center"/>
-              <w:rPr>
-                <w:b/>
-                <w:bCs/>
-              </w:rPr>
-            </w:pPr>
-            <w:r>
-              <w:rPr>
-                <w:b/>
-                <w:bCs/>
-              </w:rPr>
               <w:t>Identified Gaps</w:t>
             </w:r>
           </w:p>
@@ -25646,15 +25032,7 @@
               <w:t>not deeply coupled</w:t>
             </w:r>
             <w:r>
-              <w:t xml:space="preserve"> with ML in the BCO-</w:t>
-            </w:r>
-            <w:proofErr w:type="spellStart"/>
-            <w:r>
-              <w:t>ResNet</w:t>
-            </w:r>
-            <w:proofErr w:type="spellEnd"/>
-            <w:r>
-              <w:t xml:space="preserve"> model.</w:t>
+              <w:t xml:space="preserve"> with ML in the BCO-ResNet model.</w:t>
             </w:r>
           </w:p>
         </w:tc>
@@ -25752,15 +25130,7 @@
           </w:tcPr>
           <w:p>
             <w:r>
-              <w:t>Deep learning (</w:t>
-            </w:r>
-            <w:proofErr w:type="spellStart"/>
-            <w:r>
-              <w:t>ResNet</w:t>
-            </w:r>
-            <w:proofErr w:type="spellEnd"/>
-            <w:r>
-              <w:t>) model is a black-box approach.</w:t>
+              <w:t>Deep learning (ResNet) model is a black-box approach.</w:t>
             </w:r>
           </w:p>
         </w:tc>
@@ -26075,22 +25445,10 @@
           <w:b/>
           <w:bCs/>
         </w:rPr>
-        <w:t xml:space="preserve">general or dryland </w:t>
-      </w:r>
-      <w:proofErr w:type="gramStart"/>
-      <w:r>
-        <w:rPr>
-          <w:b/>
-          <w:bCs/>
-        </w:rPr>
-        <w:t>crops</w:t>
-      </w:r>
-      <w:r>
-        <w:t>, and</w:t>
-      </w:r>
-      <w:proofErr w:type="gramEnd"/>
-      <w:r>
-        <w:t xml:space="preserve"> fail to address the </w:t>
+        <w:t>general or dryland crops</w:t>
+      </w:r>
+      <w:r>
+        <w:t xml:space="preserve">, and fail to address the </w:t>
       </w:r>
       <w:r>
         <w:rPr>
@@ -26167,61 +25525,17 @@
           <w:b/>
           <w:bCs/>
         </w:rPr>
-        <w:t xml:space="preserve">real-time environmental </w:t>
-      </w:r>
-      <w:proofErr w:type="gramStart"/>
-      <w:r>
-        <w:rPr>
-          <w:b/>
-          <w:bCs/>
-        </w:rPr>
-        <w:t>sensing</w:t>
-      </w:r>
-      <w:r>
-        <w:rPr>
-          <w:b/>
-          <w:bCs/>
-        </w:rPr>
-        <w:t>(</w:t>
-      </w:r>
-      <w:proofErr w:type="gramEnd"/>
-      <w:r>
-        <w:rPr>
-          <w:b/>
-          <w:bCs/>
-        </w:rPr>
-        <w:t xml:space="preserve">e.g.- water </w:t>
-      </w:r>
-      <w:proofErr w:type="gramStart"/>
-      <w:r>
-        <w:rPr>
-          <w:b/>
-          <w:bCs/>
-        </w:rPr>
-        <w:t>level ,</w:t>
-      </w:r>
-      <w:proofErr w:type="gramEnd"/>
-      <w:r>
-        <w:rPr>
-          <w:b/>
-          <w:bCs/>
-        </w:rPr>
-        <w:t xml:space="preserve"> soil moisture</w:t>
-      </w:r>
-      <w:proofErr w:type="gramStart"/>
-      <w:r>
-        <w:rPr>
-          <w:b/>
-          <w:bCs/>
-        </w:rPr>
-        <w:t xml:space="preserve">) </w:t>
-      </w:r>
-      <w:r>
-        <w:t>,</w:t>
-      </w:r>
-      <w:proofErr w:type="gramEnd"/>
-      <w:r>
-        <w:t xml:space="preserve"> </w:t>
+        <w:t>real-time environmental sensing</w:t>
+      </w:r>
+      <w:r>
+        <w:rPr>
+          <w:b/>
+          <w:bCs/>
+        </w:rPr>
+        <w:t xml:space="preserve">(e.g.- water level , soil moisture) </w:t>
+      </w:r>
+      <w:r>
+        <w:t xml:space="preserve">, </w:t>
       </w:r>
       <w:r>
         <w:rPr>
@@ -26275,15 +25589,7 @@
         <w:spacing w:before="100" w:beforeAutospacing="1" w:after="100" w:afterAutospacing="1"/>
       </w:pPr>
       <w:r>
-        <w:t xml:space="preserve">Specifically </w:t>
-      </w:r>
-      <w:proofErr w:type="gramStart"/>
-      <w:r>
-        <w:t>optimizing for</w:t>
-      </w:r>
-      <w:proofErr w:type="gramEnd"/>
-      <w:r>
-        <w:t xml:space="preserve"> </w:t>
+        <w:t xml:space="preserve">Specifically optimizing for </w:t>
       </w:r>
       <w:r>
         <w:rPr>
@@ -26498,13 +25804,8 @@
             <w:hideMark/>
           </w:tcPr>
           <w:p>
-            <w:proofErr w:type="gramStart"/>
-            <w:r>
-              <w:t>Did</w:t>
-            </w:r>
-            <w:proofErr w:type="gramEnd"/>
-            <w:r>
-              <w:t xml:space="preserve"> not integrate rainfall/temperature forecasts; no real-time deployment.</w:t>
+            <w:r>
+              <w:t>Did not integrate rainfall/temperature forecasts; no real-time deployment.</w:t>
             </w:r>
           </w:p>
         </w:tc>
@@ -26538,23 +25839,7 @@
                 <w:i/>
                 <w:iCs/>
               </w:rPr>
-              <w:t xml:space="preserve">Generating Soil Salinity, Moisture, and </w:t>
-            </w:r>
-            <w:proofErr w:type="gramStart"/>
-            <w:r>
-              <w:rPr>
-                <w:i/>
-                <w:iCs/>
-              </w:rPr>
-              <w:t>pH</w:t>
-            </w:r>
-            <w:proofErr w:type="gramEnd"/>
-            <w:r>
-              <w:rPr>
-                <w:i/>
-                <w:iCs/>
-              </w:rPr>
-              <w:t xml:space="preserve"> from Remote Sensing</w:t>
+              <w:t>Generating Soil Salinity, Moisture, and pH from Remote Sensing</w:t>
             </w:r>
           </w:p>
         </w:tc>
@@ -26577,13 +25862,8 @@
             <w:hideMark/>
           </w:tcPr>
           <w:p>
-            <w:proofErr w:type="gramStart"/>
-            <w:r>
-              <w:t>Relies</w:t>
-            </w:r>
-            <w:proofErr w:type="gramEnd"/>
-            <w:r>
-              <w:t xml:space="preserve"> on external imagery; lacks real-time sensor integration.</w:t>
+            <w:r>
+              <w:t>Relies on external imagery; lacks real-time sensor integration.</w:t>
             </w:r>
           </w:p>
         </w:tc>
@@ -36408,7 +35688,6 @@
   <w:style w:type="character" w:default="1" w:styleId="DefaultParagraphFont">
     <w:name w:val="Default Paragraph Font"/>
     <w:uiPriority w:val="1"/>
-    <w:semiHidden/>
     <w:unhideWhenUsed/>
   </w:style>
   <w:style w:type="table" w:default="1" w:styleId="TableNormal">

</xml_diff>